<commit_message>
style: Remove divider line from DOCX headers
</commit_message>
<xml_diff>
--- a/Ass1/60_Assignment-1_DL.docx
+++ b/Ass1/60_Assignment-1_DL.docx
@@ -146,11 +146,7 @@
         <w:t>Subject Name : Deep Learning</w:t>
       </w:r>
     </w:p>
-    <w:p>
-      <w:r>
-        <w:t>================================================================================</w:t>
-      </w:r>
-    </w:p>
+    <w:p/>
     <w:p>
       <w:pPr>
         <w:pStyle w:val="Heading2"/>

</xml_diff>

<commit_message>
style: Match exact DOCX layout, headers, and specific sections requested by user
</commit_message>
<xml_diff>
--- a/Ass1/60_Assignment-1_DL.docx
+++ b/Ass1/60_Assignment-1_DL.docx
@@ -9,6 +9,7 @@
       <w:r>
         <w:rPr>
           <w:rFonts w:ascii="Arial" w:hAnsi="Arial"/>
+          <w:b/>
           <w:i/>
           <w:sz w:val="24"/>
         </w:rPr>
@@ -43,7 +44,6 @@
         <w:t>Practical Implementation Sheet</w:t>
       </w:r>
     </w:p>
-    <w:p/>
     <w:p>
       <w:pPr>
         <w:jc w:val="center"/>
@@ -55,7 +55,7 @@
         <w:t xml:space="preserve">Department: </w:t>
       </w:r>
       <w:r>
-        <w:t xml:space="preserve">CSE-AI        </w:t>
+        <w:t xml:space="preserve"> CSE-AI        </w:t>
       </w:r>
       <w:r>
         <w:rPr>
@@ -64,7 +64,7 @@
         <w:t>Semester: 5</w:t>
       </w:r>
       <w:r>
-        <w:t xml:space="preserve">        </w:t>
+        <w:tab/>
       </w:r>
       <w:r>
         <w:rPr>
@@ -84,16 +84,18 @@
         <w:t xml:space="preserve">Division: </w:t>
       </w:r>
       <w:r>
-        <w:t xml:space="preserve">E        </w:t>
+        <w:t xml:space="preserve">  E </w:t>
+        <w:tab/>
       </w:r>
       <w:r>
         <w:rPr>
           <w:u w:val="single"/>
         </w:rPr>
-        <w:t>Batch: 3</w:t>
+        <w:t>Batch:  3</w:t>
       </w:r>
       <w:r>
-        <w:t xml:space="preserve">        </w:t>
+        <w:t xml:space="preserve">     </w:t>
+        <w:tab/>
       </w:r>
       <w:r>
         <w:rPr>
@@ -110,10 +112,10 @@
         <w:rPr>
           <w:u w:val="single"/>
         </w:rPr>
-        <w:t xml:space="preserve">Roll no: </w:t>
+        <w:t xml:space="preserve"> Roll no: </w:t>
       </w:r>
       <w:r>
-        <w:t xml:space="preserve">60        </w:t>
+        <w:t xml:space="preserve"> 60       </w:t>
       </w:r>
       <w:r>
         <w:rPr>
@@ -122,7 +124,7 @@
         <w:t>PRN No: 12414029</w:t>
       </w:r>
       <w:r>
-        <w:t xml:space="preserve">        </w:t>
+        <w:t xml:space="preserve"> </w:t>
       </w:r>
       <w:r>
         <w:rPr>
@@ -146,75 +148,86 @@
         <w:t>Subject Name : Deep Learning</w:t>
       </w:r>
     </w:p>
-    <w:p/>
     <w:p>
-      <w:pPr>
-        <w:pStyle w:val="Heading2"/>
-      </w:pPr>
       <w:r>
-        <w:t>1. Problem Statement</w:t>
+        <w:rPr>
+          <w:rFonts w:ascii="Arial" w:hAnsi="Arial"/>
+          <w:b/>
+        </w:rPr>
+        <w:t xml:space="preserve">Problem Statement: </w:t>
+      </w:r>
+      <w:r>
+        <w:rPr>
+          <w:rFonts w:ascii="Arial" w:hAnsi="Arial"/>
+        </w:rPr>
+        <w:t>Explore Deep Learning fundamentals, set up a Python environment with TensorFlow/Keras, and implement data preprocessing and normalization techniques on the Fashion MNIST dataset.</w:t>
       </w:r>
     </w:p>
     <w:p>
       <w:r>
-        <w:t>Explore Deep Learning fundamentals, set up a Python environment with TensorFlow/Keras, and implement data preprocessing and normalization techniques on the Fashion MNIST dataset.</w:t>
-      </w:r>
-    </w:p>
-    <w:p>
-      <w:pPr>
-        <w:pStyle w:val="Heading2"/>
-      </w:pPr>
-      <w:r>
-        <w:t>2. Objectives</w:t>
+        <w:rPr>
+          <w:rFonts w:ascii="Arial" w:hAnsi="Arial"/>
+          <w:b/>
+          <w:sz w:val="22"/>
+        </w:rPr>
+        <w:t>1. Course Objectives &amp; Relevance</w:t>
       </w:r>
     </w:p>
     <w:p>
       <w:r>
-        <w:t>1. Setup Python DL environment.</w:t>
+        <w:t>1. Set up Python Deep Learning environment.</w:t>
         <w:br/>
-        <w:t>2. Load and inspect image data.</w:t>
+        <w:t>2. Load and inspect image data arrays.</w:t>
         <w:br/>
-        <w:t>3. Flatten and normalize image matrices.</w:t>
-      </w:r>
-    </w:p>
-    <w:p>
-      <w:pPr>
-        <w:pStyle w:val="Heading2"/>
-      </w:pPr>
-      <w:r>
-        <w:t>3. Methodology &amp; Algorithm</w:t>
+        <w:t>3. Flatten and normalize image matrices for neural network ingestion.</w:t>
       </w:r>
     </w:p>
     <w:p>
       <w:r>
-        <w:t>1. Load Fashion MNIST.</w:t>
-        <w:br/>
-        <w:t>2. Map labels.</w:t>
-        <w:br/>
-        <w:t>3. Normalize pixel values to [0,1].</w:t>
-        <w:br/>
-        <w:t>4. Extract samples and matrices.</w:t>
-      </w:r>
-    </w:p>
-    <w:p>
-      <w:pPr>
-        <w:pStyle w:val="Heading2"/>
-      </w:pPr>
-      <w:r>
-        <w:t>4. Conclusion</w:t>
+        <w:rPr>
+          <w:rFonts w:ascii="Arial" w:hAnsi="Arial"/>
+          <w:b/>
+          <w:sz w:val="22"/>
+        </w:rPr>
+        <w:t>2. Theoretical Foundations &amp; Mathematical Formulations</w:t>
       </w:r>
     </w:p>
     <w:p>
       <w:r>
-        <w:t>Data preprocessing is a crucial first step. Normalizing images accelerates neural network convergence by scaling all input features uniformly.</w:t>
+        <w:t>Normalization scales pixel values to [0, 1] using X' = X / 255.0. This speeds up convergence by keeping gradients within a stable, uniform range across all input features.</w:t>
       </w:r>
     </w:p>
     <w:p>
-      <w:pPr>
-        <w:pStyle w:val="Heading2"/>
-      </w:pPr>
       <w:r>
-        <w:t>5. Plots &amp; Visualizations</w:t>
+        <w:rPr>
+          <w:rFonts w:ascii="Arial" w:hAnsi="Arial"/>
+          <w:b/>
+          <w:sz w:val="22"/>
+        </w:rPr>
+        <w:t>3. Algorithm / Step-by-Step Execution Plan</w:t>
+      </w:r>
+    </w:p>
+    <w:p>
+      <w:r>
+        <w:t>1. Import TensorFlow, Keras, and Matplotlib.</w:t>
+        <w:br/>
+        <w:t>2. Load Fashion MNIST dataset.</w:t>
+        <w:br/>
+        <w:t>3. Map numeric labels to class strings.</w:t>
+        <w:br/>
+        <w:t>4. Normalize pixel intensity values.</w:t>
+        <w:br/>
+        <w:t>5. Plot raw sample matrices and images.</w:t>
+      </w:r>
+    </w:p>
+    <w:p>
+      <w:r>
+        <w:rPr>
+          <w:rFonts w:ascii="Arial" w:hAnsi="Arial"/>
+          <w:b/>
+          <w:sz w:val="22"/>
+        </w:rPr>
+        <w:t>4. Model Architecture &amp; Visualizations</w:t>
       </w:r>
     </w:p>
     <w:p>
@@ -224,7 +237,7 @@
       <w:r>
         <w:drawing>
           <wp:inline xmlns:a="http://schemas.openxmlformats.org/drawingml/2006/main" xmlns:pic="http://schemas.openxmlformats.org/drawingml/2006/picture">
-            <wp:extent cx="4572000" cy="4572000"/>
+            <wp:extent cx="5029200" cy="5029200"/>
             <wp:docPr id="1" name="Picture 1"/>
             <wp:cNvGraphicFramePr>
               <a:graphicFrameLocks noChangeAspect="1"/>
@@ -245,7 +258,7 @@
                   <pic:spPr>
                     <a:xfrm>
                       <a:off x="0" y="0"/>
-                      <a:ext cx="4572000" cy="4572000"/>
+                      <a:ext cx="5029200" cy="5029200"/>
                     </a:xfrm>
                     <a:prstGeom prst="rect"/>
                   </pic:spPr>
@@ -262,6 +275,21 @@
       </w:pPr>
       <w:r>
         <w:t>fashion_mnist_real_samples.png</w:t>
+      </w:r>
+    </w:p>
+    <w:p>
+      <w:r>
+        <w:rPr>
+          <w:rFonts w:ascii="Arial" w:hAnsi="Arial"/>
+          <w:b/>
+          <w:sz w:val="22"/>
+        </w:rPr>
+        <w:t>5. Conclusions &amp; Summary</w:t>
+      </w:r>
+    </w:p>
+    <w:p>
+      <w:r>
+        <w:t>Data preprocessing is a crucial first step. Normalizing images accelerates neural network convergence by scaling all input features uniformly, ensuring gradients behave predictably.</w:t>
       </w:r>
     </w:p>
     <w:sectPr>

</xml_diff>